<commit_message>
Fix Android package, clean repo, update auth and Firestore logic
</commit_message>
<xml_diff>
--- a/assets/templates/rcva_templatev1.docx
+++ b/assets/templates/rcva_templatev1.docx
@@ -937,7 +937,7 @@
     </w:p>
     <w:tbl>
       <w:tblPr>
-        <w:tblW w:w="13893" w:type="dxa"/>
+        <w:tblW w:w="13892" w:type="dxa"/>
         <w:jc w:val="center"/>
         <w:tblBorders>
           <w:top w:val="single" w:sz="8" w:space="0" w:color="000000"/>
@@ -951,17 +951,18 @@
         <w:tblLook w:val="0600" w:firstRow="0" w:lastRow="0" w:firstColumn="0" w:lastColumn="0" w:noHBand="1" w:noVBand="1"/>
       </w:tblPr>
       <w:tblGrid>
-        <w:gridCol w:w="6947"/>
-        <w:gridCol w:w="6946"/>
+        <w:gridCol w:w="6941"/>
+        <w:gridCol w:w="6951"/>
       </w:tblGrid>
       <w:tr>
         <w:trPr>
+          <w:cantSplit/>
           <w:trHeight w:val="114"/>
           <w:jc w:val="center"/>
         </w:trPr>
         <w:tc>
           <w:tcPr>
-            <w:tcW w:w="6947" w:type="dxa"/>
+            <w:tcW w:w="6941" w:type="dxa"/>
             <w:tcBorders>
               <w:top w:val="single" w:sz="4" w:space="0" w:color="000000"/>
               <w:left w:val="single" w:sz="4" w:space="0" w:color="000000"/>
@@ -1010,7 +1011,7 @@
         </w:tc>
         <w:tc>
           <w:tcPr>
-            <w:tcW w:w="6946" w:type="dxa"/>
+            <w:tcW w:w="6951" w:type="dxa"/>
             <w:tcBorders>
               <w:top w:val="single" w:sz="4" w:space="0" w:color="000000"/>
               <w:left w:val="single" w:sz="4" w:space="0" w:color="000000"/>
@@ -1018,12 +1019,6 @@
               <w:right w:val="single" w:sz="4" w:space="0" w:color="000000"/>
             </w:tcBorders>
             <w:shd w:val="clear" w:color="auto" w:fill="DAE9F7" w:themeFill="text2" w:themeFillTint="1A"/>
-            <w:tcMar>
-              <w:top w:w="100" w:type="dxa"/>
-              <w:left w:w="100" w:type="dxa"/>
-              <w:bottom w:w="100" w:type="dxa"/>
-              <w:right w:w="100" w:type="dxa"/>
-            </w:tcMar>
             <w:vAlign w:val="center"/>
           </w:tcPr>
           <w:p>
@@ -1047,12 +1042,13 @@
       </w:tr>
       <w:tr>
         <w:trPr>
+          <w:cantSplit/>
           <w:trHeight w:val="114"/>
           <w:jc w:val="center"/>
         </w:trPr>
         <w:tc>
           <w:tcPr>
-            <w:tcW w:w="6947" w:type="dxa"/>
+            <w:tcW w:w="6941" w:type="dxa"/>
             <w:tcBorders>
               <w:top w:val="single" w:sz="4" w:space="0" w:color="000000"/>
               <w:left w:val="single" w:sz="4" w:space="0" w:color="000000"/>
@@ -1075,7 +1071,6 @@
               <w:rPr>
                 <w:b/>
                 <w:bCs/>
-                <w:color w:val="FFFFFF"/>
               </w:rPr>
             </w:pPr>
             <w:r>
@@ -1085,6 +1080,16 @@
               </w:rPr>
               <w:t>{{ENG_TABLE_ROWS}}</w:t>
             </w:r>
+          </w:p>
+          <w:p>
+            <w:pPr>
+              <w:ind w:left="0"/>
+              <w:jc w:val="left"/>
+              <w:rPr>
+                <w:b/>
+                <w:bCs/>
+              </w:rPr>
+            </w:pPr>
             <w:r>
               <w:rPr>
                 <w:b/>
@@ -1096,7 +1101,7 @@
         </w:tc>
         <w:tc>
           <w:tcPr>
-            <w:tcW w:w="6946" w:type="dxa"/>
+            <w:tcW w:w="6951" w:type="dxa"/>
             <w:tcBorders>
               <w:top w:val="single" w:sz="4" w:space="0" w:color="000000"/>
               <w:left w:val="single" w:sz="4" w:space="0" w:color="000000"/>
@@ -1104,12 +1109,6 @@
               <w:right w:val="single" w:sz="4" w:space="0" w:color="000000"/>
             </w:tcBorders>
             <w:shd w:val="clear" w:color="auto" w:fill="auto"/>
-            <w:tcMar>
-              <w:top w:w="100" w:type="dxa"/>
-              <w:left w:w="100" w:type="dxa"/>
-              <w:bottom w:w="100" w:type="dxa"/>
-              <w:right w:w="100" w:type="dxa"/>
-            </w:tcMar>
             <w:vAlign w:val="center"/>
           </w:tcPr>
           <w:p>
@@ -1136,29 +1135,6 @@
       <w:pPr>
         <w:spacing w:line="360" w:lineRule="auto"/>
         <w:ind w:left="0"/>
-        <w:jc w:val="left"/>
-        <w:rPr>
-          <w:b/>
-          <w:bCs/>
-        </w:rPr>
-      </w:pPr>
-    </w:p>
-    <w:p>
-      <w:pPr>
-        <w:spacing w:line="360" w:lineRule="auto"/>
-        <w:ind w:left="0"/>
-        <w:jc w:val="left"/>
-        <w:rPr>
-          <w:b/>
-          <w:bCs/>
-        </w:rPr>
-      </w:pPr>
-    </w:p>
-    <w:p>
-      <w:pPr>
-        <w:spacing w:line="360" w:lineRule="auto"/>
-        <w:ind w:left="0"/>
-        <w:jc w:val="center"/>
         <w:rPr>
           <w:b/>
           <w:bCs/>
@@ -1166,17 +1142,10 @@
           <w:szCs w:val="2"/>
         </w:rPr>
       </w:pPr>
-      <w:r>
-        <w:rPr>
-          <w:b/>
-          <w:bCs/>
-        </w:rPr>
-        <w:t>Table {{LOCATION_NO}}: Identified Enforcement issue and Action Plan {{LOCATION_NAME}}</w:t>
-      </w:r>
     </w:p>
     <w:tbl>
       <w:tblPr>
-        <w:tblW w:w="13893" w:type="dxa"/>
+        <w:tblW w:w="13892" w:type="dxa"/>
         <w:jc w:val="center"/>
         <w:tblBorders>
           <w:top w:val="single" w:sz="8" w:space="0" w:color="000000"/>
@@ -1190,17 +1159,18 @@
         <w:tblLook w:val="0600" w:firstRow="0" w:lastRow="0" w:firstColumn="0" w:lastColumn="0" w:noHBand="1" w:noVBand="1"/>
       </w:tblPr>
       <w:tblGrid>
-        <w:gridCol w:w="8653"/>
-        <w:gridCol w:w="5240"/>
+        <w:gridCol w:w="6941"/>
+        <w:gridCol w:w="6951"/>
       </w:tblGrid>
       <w:tr>
         <w:trPr>
+          <w:cantSplit/>
           <w:trHeight w:val="114"/>
           <w:jc w:val="center"/>
         </w:trPr>
         <w:tc>
           <w:tcPr>
-            <w:tcW w:w="8653" w:type="dxa"/>
+            <w:tcW w:w="6941" w:type="dxa"/>
             <w:tcBorders>
               <w:top w:val="single" w:sz="4" w:space="0" w:color="000000"/>
               <w:left w:val="single" w:sz="4" w:space="0" w:color="000000"/>
@@ -1236,7 +1206,7 @@
         </w:tc>
         <w:tc>
           <w:tcPr>
-            <w:tcW w:w="5240" w:type="dxa"/>
+            <w:tcW w:w="6951" w:type="dxa"/>
             <w:tcBorders>
               <w:top w:val="single" w:sz="4" w:space="0" w:color="000000"/>
               <w:left w:val="single" w:sz="4" w:space="0" w:color="000000"/>
@@ -1273,12 +1243,13 @@
       </w:tr>
       <w:tr>
         <w:trPr>
+          <w:cantSplit/>
           <w:trHeight w:val="114"/>
           <w:jc w:val="center"/>
         </w:trPr>
         <w:tc>
           <w:tcPr>
-            <w:tcW w:w="8653" w:type="dxa"/>
+            <w:tcW w:w="6941" w:type="dxa"/>
             <w:tcBorders>
               <w:top w:val="single" w:sz="4" w:space="0" w:color="000000"/>
               <w:left w:val="single" w:sz="4" w:space="0" w:color="000000"/>
@@ -1301,7 +1272,6 @@
               <w:rPr>
                 <w:b/>
                 <w:bCs/>
-                <w:color w:val="FFFFFF"/>
               </w:rPr>
             </w:pPr>
             <w:r>
@@ -1311,6 +1281,16 @@
               </w:rPr>
               <w:t>{{ENF_TABLE_ROWS}}</w:t>
             </w:r>
+          </w:p>
+          <w:p>
+            <w:pPr>
+              <w:ind w:left="0"/>
+              <w:jc w:val="left"/>
+              <w:rPr>
+                <w:b/>
+                <w:bCs/>
+              </w:rPr>
+            </w:pPr>
             <w:r>
               <w:rPr>
                 <w:b/>
@@ -1322,7 +1302,7 @@
         </w:tc>
         <w:tc>
           <w:tcPr>
-            <w:tcW w:w="5240" w:type="dxa"/>
+            <w:tcW w:w="6951" w:type="dxa"/>
             <w:tcBorders>
               <w:top w:val="single" w:sz="4" w:space="0" w:color="000000"/>
               <w:left w:val="single" w:sz="4" w:space="0" w:color="000000"/>
@@ -1358,19 +1338,6 @@
         </w:tc>
       </w:tr>
     </w:tbl>
-    <w:p>
-      <w:pPr>
-        <w:spacing w:line="360" w:lineRule="auto"/>
-        <w:ind w:left="0"/>
-        <w:jc w:val="left"/>
-        <w:rPr>
-          <w:b/>
-          <w:bCs/>
-          <w:i/>
-          <w:iCs/>
-        </w:rPr>
-      </w:pPr>
-    </w:p>
     <w:p>
       <w:pPr>
         <w:spacing w:line="360" w:lineRule="auto"/>

</xml_diff>